<commit_message>
fix(fire): the training themes 3.1 cite a fire-safety module in a periodic session with the posts that apply it when other posts of the category do not ("I.P.S.U. Lucrul cu foc deschis, art. 1–7 (Electrician, Lăcătuș mecanic)"), name the client's workplaces as the place of every chapter, from fireThemes.workplaceNames, where they named the company, keep the last rows of each eight-hour plan with its total, leave the total's number cell empty instead of "--", and call the IPSU's chapter VI "Alte obligații privind apărarea împotriva incendiilor" as the IPSU now does
</commit_message>
<xml_diff>
--- a/packages/document-engine/templates/fire/3.1_fire_training_themes.docx
+++ b/packages/document-engine/templates/fire/3.1_fire_training_themes.docx
@@ -73,7 +73,7 @@
           <w:szCs w:val="20"/>
           <w:lang w:val="ro-RO"/>
         </w:rPr>
-        <w:t>LOCUL DE MUNCĂ: {{client.legalName}}</w:t>
+        <w:t>LOCUL DE MUNCĂ: {{fireThemes.workplaceNames}}</w:t>
       </w:r>
     </w:p>
     <w:p>
@@ -1623,7 +1623,7 @@
                 <w:szCs w:val="20"/>
                 <w:lang w:val="ro-RO"/>
               </w:rPr>
-              <w:t>Alte obligații privind prevenirea și stingerea incendiilor</w:t>
+              <w:t>Alte obligații privind apărarea împotriva incendiilor</w:t>
             </w:r>
           </w:p>
         </w:tc>
@@ -3928,7 +3928,7 @@
           <w:p>
             <w:pPr>
               <w:pStyle w:val="TableContents"/>
-              <w:keepNext w:val="false"/>
+              <w:keepNext w:val="true"/>
               <w:widowControl/>
               <w:bidi w:val="0"/>
               <w:spacing w:before="0" w:after="0"/>
@@ -3974,7 +3974,7 @@
           <w:p>
             <w:pPr>
               <w:pStyle w:val="TableContents"/>
-              <w:keepNext w:val="false"/>
+              <w:keepNext w:val="true"/>
               <w:widowControl/>
               <w:bidi w:val="0"/>
               <w:spacing w:before="0" w:after="0"/>
@@ -4021,7 +4021,7 @@
           <w:p>
             <w:pPr>
               <w:pStyle w:val="TableContents"/>
-              <w:keepNext w:val="false"/>
+              <w:keepNext w:val="true"/>
               <w:widowControl/>
               <w:bidi w:val="0"/>
               <w:spacing w:before="0" w:after="0"/>
@@ -4071,7 +4071,7 @@
           <w:p>
             <w:pPr>
               <w:pStyle w:val="TableContents"/>
-              <w:keepNext w:val="false"/>
+              <w:keepNext w:val="true"/>
               <w:widowControl/>
               <w:bidi w:val="0"/>
               <w:spacing w:before="0" w:after="0"/>
@@ -4118,7 +4118,7 @@
           <w:p>
             <w:pPr>
               <w:pStyle w:val="TableContents"/>
-              <w:keepNext w:val="false"/>
+              <w:keepNext w:val="true"/>
               <w:widowControl/>
               <w:bidi w:val="0"/>
               <w:spacing w:before="0" w:after="0"/>
@@ -4165,7 +4165,7 @@
           <w:p>
             <w:pPr>
               <w:pStyle w:val="TableContents"/>
-              <w:keepNext w:val="false"/>
+              <w:keepNext w:val="true"/>
               <w:widowControl/>
               <w:bidi w:val="0"/>
               <w:spacing w:before="0" w:after="0"/>
@@ -4246,7 +4246,7 @@
                 <w:szCs w:val="20"/>
                 <w:lang w:val="ro-RO"/>
               </w:rPr>
-              <w:t>--</w:t>
+              <w:t/>
             </w:r>
           </w:p>
         </w:tc>
@@ -4491,7 +4491,7 @@
           <w:szCs w:val="20"/>
           <w:lang w:val="ro-RO"/>
         </w:rPr>
-        <w:t>LOCUL DE MUNCĂ: {{client.legalName}}</w:t>
+        <w:t>LOCUL DE MUNCĂ: {{fireThemes.workplaceNames}}</w:t>
       </w:r>
     </w:p>
     <w:p>
@@ -7960,7 +7960,7 @@
           <w:p>
             <w:pPr>
               <w:pStyle w:val="TableContents"/>
-              <w:keepNext w:val="false"/>
+              <w:keepNext w:val="true"/>
               <w:widowControl/>
               <w:bidi w:val="0"/>
               <w:spacing w:before="0" w:after="0"/>
@@ -8006,7 +8006,7 @@
           <w:p>
             <w:pPr>
               <w:pStyle w:val="TableContents"/>
-              <w:keepNext w:val="false"/>
+              <w:keepNext w:val="true"/>
               <w:widowControl/>
               <w:bidi w:val="0"/>
               <w:spacing w:before="0" w:after="0"/>
@@ -8053,7 +8053,7 @@
           <w:p>
             <w:pPr>
               <w:pStyle w:val="TableContents"/>
-              <w:keepNext w:val="false"/>
+              <w:keepNext w:val="true"/>
               <w:widowControl/>
               <w:bidi w:val="0"/>
               <w:spacing w:before="0" w:after="0"/>
@@ -8103,7 +8103,7 @@
           <w:p>
             <w:pPr>
               <w:pStyle w:val="TableContents"/>
-              <w:keepNext w:val="false"/>
+              <w:keepNext w:val="true"/>
               <w:widowControl/>
               <w:bidi w:val="0"/>
               <w:spacing w:before="0" w:after="0"/>
@@ -8150,7 +8150,7 @@
           <w:p>
             <w:pPr>
               <w:pStyle w:val="TableContents"/>
-              <w:keepNext w:val="false"/>
+              <w:keepNext w:val="true"/>
               <w:widowControl/>
               <w:bidi w:val="0"/>
               <w:spacing w:before="0" w:after="0"/>
@@ -8197,7 +8197,7 @@
           <w:p>
             <w:pPr>
               <w:pStyle w:val="TableContents"/>
-              <w:keepNext w:val="false"/>
+              <w:keepNext w:val="true"/>
               <w:widowControl/>
               <w:bidi w:val="0"/>
               <w:spacing w:before="0" w:after="0"/>
@@ -8278,7 +8278,7 @@
                 <w:szCs w:val="20"/>
                 <w:lang w:val="ro-RO"/>
               </w:rPr>
-              <w:t>--</w:t>
+              <w:t/>
             </w:r>
           </w:p>
         </w:tc>
@@ -8523,7 +8523,7 @@
           <w:szCs w:val="20"/>
           <w:lang w:val="ro-RO"/>
         </w:rPr>
-        <w:t>LOCUL DE MUNCĂ: {{client.legalName}}</w:t>
+        <w:t>LOCUL DE MUNCĂ: {{fireThemes.workplaceNames}}</w:t>
       </w:r>
     </w:p>
     <w:p>

</xml_diff>